<commit_message>
Update Class 15 materials.
</commit_message>
<xml_diff>
--- a/class15w.docx
+++ b/class15w.docx
@@ -3099,13 +3099,13 @@
       </w:r>
     </w:p>
     <w:bookmarkEnd w:id="32"/>
-    <w:bookmarkStart w:id="33" w:name="early-work-power-sample-size-2"/>
+    <w:bookmarkStart w:id="33" w:name="early-work-2"/>
     <w:p>
       <w:pPr>
         <w:pStyle w:val="Heading2"/>
       </w:pPr>
       <w:r>
-        <w:t xml:space="preserve">Early Work: Power &amp; Sample Size (2)</w:t>
+        <w:t xml:space="preserve">Early Work (2)</w:t>
       </w:r>
     </w:p>
     <w:p>
@@ -3167,13 +3167,13 @@
       </w:r>
     </w:p>
     <w:bookmarkEnd w:id="34"/>
-    <w:bookmarkStart w:id="35" w:name="late-work-power-sample-size-2"/>
+    <w:bookmarkStart w:id="35" w:name="late-work-2"/>
     <w:p>
       <w:pPr>
         <w:pStyle w:val="Heading2"/>
       </w:pPr>
       <w:r>
-        <w:t xml:space="preserve">Late Work: Power &amp; Sample Size (2)</w:t>
+        <w:t xml:space="preserve">Late Work (2)</w:t>
       </w:r>
     </w:p>
     <w:p>
@@ -3344,22 +3344,22 @@
       </w:r>
     </w:p>
     <w:bookmarkEnd w:id="40"/>
-    <w:bookmarkStart w:id="49" w:name="project-a"/>
+    <w:bookmarkStart w:id="49" w:name="X9b8186038dd8a161548d1b968f39c6e9578f977"/>
     <w:p>
       <w:pPr>
         <w:pStyle w:val="Heading1"/>
       </w:pPr>
       <w:r>
-        <w:t xml:space="preserve">Project A</w:t>
-      </w:r>
-    </w:p>
-    <w:bookmarkStart w:id="44" w:name="project-a-due-2026-10-21-at-noon"/>
+        <w:t xml:space="preserve">Project A is now due Monday 2026-10-26 at 9 AM</w:t>
+      </w:r>
+    </w:p>
+    <w:bookmarkStart w:id="44" w:name="project-a-due-2026-10-26-at-9-am"/>
     <w:p>
       <w:pPr>
         <w:pStyle w:val="Heading2"/>
       </w:pPr>
       <w:r>
-        <w:t xml:space="preserve">Project A due 2026-10-21 at noon</w:t>
+        <w:t xml:space="preserve">Project A due 2026-10-26 at 9 AM</w:t>
       </w:r>
     </w:p>
     <w:p>

</xml_diff>